<commit_message>
docs: add Part 5 Scenario Spotlights to the demo outline
Adds the two demo-able scenarios from the panel/interview list, both starting
from existing records so the contract journey is not retraced:
- 7.1 Two events on one day and an item runs short (same-day availability,
  purchase vs rental, feeding the budget request shown in Part 2)
- 7.2 An item is damaged during the event (incident register, missing-and-damaged
  accountability, surfacing in the reports shown in Part 3)
- 7.3 notes late payment and rejected budget were already covered in Parts 4 and 2

Scenarios with no implementation (cancellation refund, Food-To-Go, reschedule)
are excluded from the demo per instruction. Table 1.1 and the timing table
updated; demo now ~15 minutes.

Co-Authored-By: Claude Opus 4.8 <noreply@anthropic.com>
</commit_message>
<xml_diff>
--- a/docs/Demo-Outline-Accounting-and-Reports.docx
+++ b/docs/Demo-Outline-Accounting-and-Reports.docx
@@ -966,6 +966,108 @@
                 <w:sz w:val="19"/>
                 <w:szCs w:val="19"/>
               </w:rPr>
+              <w:t xml:space="preserve">5</w:t>
+            </w:r>
+          </w:p>
+        </w:tc>
+        <w:tc>
+          <w:tcPr>
+            <w:tcW w:type="dxa" w:w="3300"/>
+            <w:tcMar>
+              <w:top w:type="dxa" w:w="60"/>
+              <w:left w:type="dxa" w:w="90"/>
+              <w:bottom w:type="dxa" w:w="60"/>
+              <w:right w:type="dxa" w:w="90"/>
+            </w:tcMar>
+          </w:tcPr>
+          <w:p>
+            <w:pPr>
+              <w:spacing w:after="0" w:line="252"/>
+            </w:pPr>
+            <w:r>
+              <w:rPr>
+                <w:rFonts w:ascii="Times New Roman" w:cs="Times New Roman" w:eastAsia="Times New Roman" w:hAnsi="Times New Roman"/>
+                <w:color w:val="1A1A1A"/>
+                <w:sz w:val="19"/>
+                <w:szCs w:val="19"/>
+              </w:rPr>
+              <w:t xml:space="preserve">Scenario spotlights (same-day shortage; post-event incident)</w:t>
+            </w:r>
+          </w:p>
+        </w:tc>
+        <w:tc>
+          <w:tcPr>
+            <w:tcW w:type="dxa" w:w="2700"/>
+            <w:tcMar>
+              <w:top w:type="dxa" w:w="60"/>
+              <w:left w:type="dxa" w:w="90"/>
+              <w:bottom w:type="dxa" w:w="60"/>
+              <w:right w:type="dxa" w:w="90"/>
+            </w:tcMar>
+          </w:tcPr>
+          <w:p>
+            <w:pPr>
+              <w:spacing w:after="0" w:line="252"/>
+            </w:pPr>
+            <w:r>
+              <w:rPr>
+                <w:rFonts w:ascii="Times New Roman" w:cs="Times New Roman" w:eastAsia="Times New Roman" w:hAnsi="Times New Roman"/>
+                <w:color w:val="1A1A1A"/>
+                <w:sz w:val="19"/>
+                <w:szCs w:val="19"/>
+              </w:rPr>
+              <w:t xml:space="preserve">§11.3 · §13.3 · §5.7 / 6.7 / 7.8</w:t>
+            </w:r>
+          </w:p>
+        </w:tc>
+        <w:tc>
+          <w:tcPr>
+            <w:tcW w:type="dxa" w:w="2700"/>
+            <w:tcMar>
+              <w:top w:type="dxa" w:w="60"/>
+              <w:left w:type="dxa" w:w="90"/>
+              <w:bottom w:type="dxa" w:w="60"/>
+              <w:right w:type="dxa" w:w="90"/>
+            </w:tcMar>
+          </w:tcPr>
+          <w:p>
+            <w:pPr>
+              <w:spacing w:after="0" w:line="252"/>
+            </w:pPr>
+            <w:r>
+              <w:rPr>
+                <w:rFonts w:ascii="Times New Roman" w:cs="Times New Roman" w:eastAsia="Times New Roman" w:hAnsi="Times New Roman"/>
+                <w:color w:val="1A1A1A"/>
+                <w:sz w:val="19"/>
+                <w:szCs w:val="19"/>
+              </w:rPr>
+              <w:t xml:space="preserve">Figures 13.3.1 · 13.3.2</w:t>
+            </w:r>
+          </w:p>
+        </w:tc>
+      </w:tr>
+      <w:tr>
+        <w:tc>
+          <w:tcPr>
+            <w:tcW w:type="dxa" w:w="700"/>
+            <w:tcMar>
+              <w:top w:type="dxa" w:w="60"/>
+              <w:left w:type="dxa" w:w="90"/>
+              <w:bottom w:type="dxa" w:w="60"/>
+              <w:right w:type="dxa" w:w="90"/>
+            </w:tcMar>
+          </w:tcPr>
+          <w:p>
+            <w:pPr>
+              <w:spacing w:after="0" w:line="252"/>
+            </w:pPr>
+            <w:r>
+              <w:rPr>
+                <w:rFonts w:ascii="Times New Roman" w:cs="Times New Roman" w:eastAsia="Times New Roman" w:hAnsi="Times New Roman"/>
+                <w:color w:val="1A1A1A"/>
+                <w:sz w:val="19"/>
+                <w:szCs w:val="19"/>
+              </w:rPr>
               <w:t xml:space="preserve">—</w:t>
             </w:r>
           </w:p>
@@ -3429,7 +3531,37 @@
           <w:sz w:val="40"/>
           <w:szCs w:val="40"/>
         </w:rPr>
-        <w:t xml:space="preserve">7. Revisions Demonstrated</w:t>
+        <w:t xml:space="preserve">7. Part 5 — Scenario Spotlights</w:t>
+      </w:r>
+    </w:p>
+    <w:p>
+      <w:pPr>
+        <w:spacing w:before="80" w:after="160"/>
+        <w:ind w:left="120"/>
+        <w:pBdr>
+          <w:left w:val="single" w:sz="18" w:space="6" w:color="491321"/>
+        </w:pBdr>
+        <w:shd w:val="clear" w:fill="F7F1F4"/>
+      </w:pPr>
+      <w:r>
+        <w:rPr>
+          <w:rFonts w:ascii="Times New Roman" w:cs="Times New Roman" w:eastAsia="Times New Roman" w:hAnsi="Times New Roman"/>
+          <w:b/>
+          <w:bCs/>
+          <w:color w:val="491321"/>
+          <w:sz w:val="19"/>
+          <w:szCs w:val="19"/>
+        </w:rPr>
+        <w:t xml:space="preserve">USER MANUAL: </w:t>
+      </w:r>
+      <w:r>
+        <w:rPr>
+          <w:rFonts w:ascii="Times New Roman" w:cs="Times New Roman" w:eastAsia="Times New Roman" w:hAnsi="Times New Roman"/>
+          <w:color w:val="491321"/>
+          <w:sz w:val="19"/>
+          <w:szCs w:val="19"/>
+        </w:rPr>
+        <w:t xml:space="preserve">§4.7 · §11.3 Processing a Request · §13.3 Incidents · §5.7 / 6.7 / 7.8 Department Scenarios · Figures 13.3.1 and 13.3.2</w:t>
       </w:r>
     </w:p>
     <w:p>
@@ -3439,11 +3571,22 @@
       <w:r>
         <w:rPr>
           <w:rFonts w:ascii="Times New Roman" w:cs="Times New Roman" w:eastAsia="Times New Roman" w:hAnsi="Times New Roman"/>
-          <w:sz w:val="22"/>
-          <w:szCs w:val="22"/>
-          <w:color w:val="1A1A1A"/>
-        </w:rPr>
-        <w:t xml:space="preserve">The revisions below are the ones visible during this demonstration. They are drawn from the two-week development cycle of 22 to 29 July 2026.</w:t>
+          <w:b/>
+          <w:bCs/>
+          <w:sz w:val="22"/>
+          <w:szCs w:val="22"/>
+          <w:color w:val="1A1A1A"/>
+        </w:rPr>
+        <w:t xml:space="preserve">Duration:</w:t>
+      </w:r>
+      <w:r>
+        <w:rPr>
+          <w:rFonts w:ascii="Times New Roman" w:cs="Times New Roman" w:eastAsia="Times New Roman" w:hAnsi="Times New Roman"/>
+          <w:sz w:val="22"/>
+          <w:szCs w:val="22"/>
+          <w:color w:val="1A1A1A"/>
+        </w:rPr>
+        <w:t xml:space="preserve"> approximately 3 minutes. Two short scenarios that feed directly into the two modules already shown: the first explains where a budget request originates, the second shows how an operational problem reaches the reports. Neither requires revisiting the contract journey — each begins from an existing record.</w:t>
       </w:r>
     </w:p>
     <w:p>
@@ -3459,7 +3602,779 @@
           <w:sz w:val="28"/>
           <w:szCs w:val="28"/>
         </w:rPr>
-        <w:t xml:space="preserve">7.1 Revisions Shown Directly</w:t>
+        <w:t xml:space="preserve">7.1 Scenario A — Two Events on One Day and an Item Runs Short</w:t>
+      </w:r>
+    </w:p>
+    <w:p>
+      <w:pPr>
+        <w:spacing w:after="140"/>
+        <w:ind w:left="360"/>
+      </w:pPr>
+      <w:r>
+        <w:rPr>
+          <w:rFonts w:ascii="Times New Roman" w:cs="Times New Roman" w:eastAsia="Times New Roman" w:hAnsi="Times New Roman"/>
+          <w:b/>
+          <w:bCs/>
+          <w:color w:val="5F5F5F"/>
+          <w:sz w:val="21"/>
+          <w:szCs w:val="21"/>
+        </w:rPr>
+        <w:t xml:space="preserve">Say: </w:t>
+      </w:r>
+      <w:r>
+        <w:rPr>
+          <w:rFonts w:ascii="Times New Roman" w:cs="Times New Roman" w:eastAsia="Times New Roman" w:hAnsi="Times New Roman"/>
+          <w:i/>
+          <w:iCs/>
+          <w:color w:val="3A3A3A"/>
+          <w:sz w:val="21"/>
+          <w:szCs w:val="21"/>
+        </w:rPr>
+        <w:t xml:space="preserve">“Two events fall on the same date and there is not enough stock for both. This is where the budget requests you just approved actually come from.”</w:t>
+      </w:r>
+    </w:p>
+    <w:p>
+      <w:pPr>
+        <w:spacing w:after="80"/>
+        <w:ind w:left="480" w:hanging="360"/>
+      </w:pPr>
+      <w:r>
+        <w:rPr>
+          <w:rFonts w:ascii="Times New Roman" w:cs="Times New Roman" w:eastAsia="Times New Roman" w:hAnsi="Times New Roman"/>
+          <w:b/>
+          <w:bCs/>
+          <w:sz w:val="22"/>
+          <w:szCs w:val="22"/>
+          <w:color w:val="1A1A1A"/>
+        </w:rPr>
+        <w:t xml:space="preserve">1.</w:t>
+      </w:r>
+      <w:r>
+        <w:rPr>
+          <w:rFonts w:ascii="Times New Roman" w:cs="Times New Roman" w:eastAsia="Times New Roman" w:hAnsi="Times New Roman"/>
+          <w:sz w:val="22"/>
+          <w:szCs w:val="22"/>
+          <w:color w:val="1A1A1A"/>
+        </w:rPr>
+        <w:t xml:space="preserve"> Open the same-day pair </w:t>
+      </w:r>
+      <w:r>
+        <w:rPr>
+          <w:rFonts w:ascii="Times New Roman" w:cs="Times New Roman" w:eastAsia="Times New Roman" w:hAnsi="Times New Roman"/>
+          <w:b/>
+          <w:bCs/>
+          <w:sz w:val="22"/>
+          <w:szCs w:val="22"/>
+          <w:color w:val="1A1A1A"/>
+        </w:rPr>
+        <w:t xml:space="preserve">SCN-SAMEDAY-RESERVED-A</w:t>
+      </w:r>
+      <w:r>
+        <w:rPr>
+          <w:rFonts w:ascii="Times New Roman" w:cs="Times New Roman" w:eastAsia="Times New Roman" w:hAnsi="Times New Roman"/>
+          <w:sz w:val="22"/>
+          <w:szCs w:val="22"/>
+          <w:color w:val="1A1A1A"/>
+        </w:rPr>
+        <w:t xml:space="preserve"> and </w:t>
+      </w:r>
+      <w:r>
+        <w:rPr>
+          <w:rFonts w:ascii="Times New Roman" w:cs="Times New Roman" w:eastAsia="Times New Roman" w:hAnsi="Times New Roman"/>
+          <w:b/>
+          <w:bCs/>
+          <w:sz w:val="22"/>
+          <w:szCs w:val="22"/>
+          <w:color w:val="1A1A1A"/>
+        </w:rPr>
+        <w:t xml:space="preserve">SCN-SAMEDAY-CONFLICT-B</w:t>
+      </w:r>
+      <w:r>
+        <w:rPr>
+          <w:rFonts w:ascii="Times New Roman" w:cs="Times New Roman" w:eastAsia="Times New Roman" w:hAnsi="Times New Roman"/>
+          <w:sz w:val="22"/>
+          <w:szCs w:val="22"/>
+          <w:color w:val="1A1A1A"/>
+        </w:rPr>
+        <w:t xml:space="preserve">, both scheduled on 6 August 2026.</w:t>
+      </w:r>
+    </w:p>
+    <w:p>
+      <w:pPr>
+        <w:spacing w:after="80"/>
+        <w:ind w:left="480" w:hanging="360"/>
+      </w:pPr>
+      <w:r>
+        <w:rPr>
+          <w:rFonts w:ascii="Times New Roman" w:cs="Times New Roman" w:eastAsia="Times New Roman" w:hAnsi="Times New Roman"/>
+          <w:b/>
+          <w:bCs/>
+          <w:sz w:val="22"/>
+          <w:szCs w:val="22"/>
+          <w:color w:val="1A1A1A"/>
+        </w:rPr>
+        <w:t xml:space="preserve">2.</w:t>
+      </w:r>
+      <w:r>
+        <w:rPr>
+          <w:rFonts w:ascii="Times New Roman" w:cs="Times New Roman" w:eastAsia="Times New Roman" w:hAnsi="Times New Roman"/>
+          <w:sz w:val="22"/>
+          <w:szCs w:val="22"/>
+          <w:color w:val="1A1A1A"/>
+        </w:rPr>
+        <w:t xml:space="preserve"> Show that item availability is calculated </w:t>
+      </w:r>
+      <w:r>
+        <w:rPr>
+          <w:rFonts w:ascii="Times New Roman" w:cs="Times New Roman" w:eastAsia="Times New Roman" w:hAnsi="Times New Roman"/>
+          <w:b/>
+          <w:bCs/>
+          <w:sz w:val="22"/>
+          <w:szCs w:val="22"/>
+          <w:color w:val="1A1A1A"/>
+        </w:rPr>
+        <w:t xml:space="preserve">per event date</w:t>
+      </w:r>
+      <w:r>
+        <w:rPr>
+          <w:rFonts w:ascii="Times New Roman" w:cs="Times New Roman" w:eastAsia="Times New Roman" w:hAnsi="Times New Roman"/>
+          <w:sz w:val="22"/>
+          <w:szCs w:val="22"/>
+          <w:color w:val="1A1A1A"/>
+        </w:rPr>
+        <w:t xml:space="preserve">: the quantity already committed to the first event is unavailable to the second, and the system proposes same-day alternatives.</w:t>
+      </w:r>
+    </w:p>
+    <w:p>
+      <w:pPr>
+        <w:spacing w:after="80"/>
+        <w:ind w:left="480" w:hanging="360"/>
+      </w:pPr>
+      <w:r>
+        <w:rPr>
+          <w:rFonts w:ascii="Times New Roman" w:cs="Times New Roman" w:eastAsia="Times New Roman" w:hAnsi="Times New Roman"/>
+          <w:b/>
+          <w:bCs/>
+          <w:sz w:val="22"/>
+          <w:szCs w:val="22"/>
+          <w:color w:val="1A1A1A"/>
+        </w:rPr>
+        <w:t xml:space="preserve">3.</w:t>
+      </w:r>
+      <w:r>
+        <w:rPr>
+          <w:rFonts w:ascii="Times New Roman" w:cs="Times New Roman" w:eastAsia="Times New Roman" w:hAnsi="Times New Roman"/>
+          <w:sz w:val="22"/>
+          <w:szCs w:val="22"/>
+          <w:color w:val="1A1A1A"/>
+        </w:rPr>
+        <w:t xml:space="preserve"> Explain the department’s decision when no alternative covers the shortage — the item is either </w:t>
+      </w:r>
+      <w:r>
+        <w:rPr>
+          <w:rFonts w:ascii="Times New Roman" w:cs="Times New Roman" w:eastAsia="Times New Roman" w:hAnsi="Times New Roman"/>
+          <w:b/>
+          <w:bCs/>
+          <w:sz w:val="22"/>
+          <w:szCs w:val="22"/>
+          <w:color w:val="1A1A1A"/>
+        </w:rPr>
+        <w:t xml:space="preserve">purchased</w:t>
+      </w:r>
+      <w:r>
+        <w:rPr>
+          <w:rFonts w:ascii="Times New Roman" w:cs="Times New Roman" w:eastAsia="Times New Roman" w:hAnsi="Times New Roman"/>
+          <w:sz w:val="22"/>
+          <w:szCs w:val="22"/>
+          <w:color w:val="1A1A1A"/>
+        </w:rPr>
+        <w:t xml:space="preserve"> or </w:t>
+      </w:r>
+      <w:r>
+        <w:rPr>
+          <w:rFonts w:ascii="Times New Roman" w:cs="Times New Roman" w:eastAsia="Times New Roman" w:hAnsi="Times New Roman"/>
+          <w:b/>
+          <w:bCs/>
+          <w:sz w:val="22"/>
+          <w:szCs w:val="22"/>
+          <w:color w:val="1A1A1A"/>
+        </w:rPr>
+        <w:t xml:space="preserve">rented</w:t>
+      </w:r>
+      <w:r>
+        <w:rPr>
+          <w:rFonts w:ascii="Times New Roman" w:cs="Times New Roman" w:eastAsia="Times New Roman" w:hAnsi="Times New Roman"/>
+          <w:sz w:val="22"/>
+          <w:szCs w:val="22"/>
+          <w:color w:val="1A1A1A"/>
+        </w:rPr>
+        <w:t xml:space="preserve">. Company practice is to look for a purchase first and turn to rental only when the item cannot be bought or is needed once.</w:t>
+      </w:r>
+    </w:p>
+    <w:p>
+      <w:pPr>
+        <w:spacing w:after="80"/>
+        <w:ind w:left="480" w:hanging="360"/>
+      </w:pPr>
+      <w:r>
+        <w:rPr>
+          <w:rFonts w:ascii="Times New Roman" w:cs="Times New Roman" w:eastAsia="Times New Roman" w:hAnsi="Times New Roman"/>
+          <w:b/>
+          <w:bCs/>
+          <w:sz w:val="22"/>
+          <w:szCs w:val="22"/>
+          <w:color w:val="1A1A1A"/>
+        </w:rPr>
+        <w:t xml:space="preserve">4.</w:t>
+      </w:r>
+      <w:r>
+        <w:rPr>
+          <w:rFonts w:ascii="Times New Roman" w:cs="Times New Roman" w:eastAsia="Times New Roman" w:hAnsi="Times New Roman"/>
+          <w:sz w:val="22"/>
+          <w:szCs w:val="22"/>
+          <w:color w:val="1A1A1A"/>
+        </w:rPr>
+        <w:t xml:space="preserve"> Show the two live examples in the approval queue: </w:t>
+      </w:r>
+      <w:r>
+        <w:rPr>
+          <w:rFonts w:ascii="Times New Roman" w:cs="Times New Roman" w:eastAsia="Times New Roman" w:hAnsi="Times New Roman"/>
+          <w:b/>
+          <w:bCs/>
+          <w:sz w:val="22"/>
+          <w:szCs w:val="22"/>
+          <w:color w:val="1A1A1A"/>
+        </w:rPr>
+        <w:t xml:space="preserve">RPT-PR-2606-0001</w:t>
+      </w:r>
+      <w:r>
+        <w:rPr>
+          <w:rFonts w:ascii="Times New Roman" w:cs="Times New Roman" w:eastAsia="Times New Roman" w:hAnsi="Times New Roman"/>
+          <w:sz w:val="22"/>
+          <w:szCs w:val="22"/>
+          <w:color w:val="1A1A1A"/>
+        </w:rPr>
+        <w:t xml:space="preserve"> (Linen · Champagne Napkin · short 68 · </w:t>
+      </w:r>
+      <w:r>
+        <w:rPr>
+          <w:rFonts w:ascii="Times New Roman" w:cs="Times New Roman" w:eastAsia="Times New Roman" w:hAnsi="Times New Roman"/>
+          <w:b/>
+          <w:bCs/>
+          <w:sz w:val="22"/>
+          <w:szCs w:val="22"/>
+          <w:color w:val="1A1A1A"/>
+        </w:rPr>
+        <w:t xml:space="preserve">purchase</w:t>
+      </w:r>
+      <w:r>
+        <w:rPr>
+          <w:rFonts w:ascii="Times New Roman" w:cs="Times New Roman" w:eastAsia="Times New Roman" w:hAnsi="Times New Roman"/>
+          <w:sz w:val="22"/>
+          <w:szCs w:val="22"/>
+          <w:color w:val="1A1A1A"/>
+        </w:rPr>
+        <w:t xml:space="preserve">) and </w:t>
+      </w:r>
+      <w:r>
+        <w:rPr>
+          <w:rFonts w:ascii="Times New Roman" w:cs="Times New Roman" w:eastAsia="Times New Roman" w:hAnsi="Times New Roman"/>
+          <w:b/>
+          <w:bCs/>
+          <w:sz w:val="22"/>
+          <w:szCs w:val="22"/>
+          <w:color w:val="1A1A1A"/>
+        </w:rPr>
+        <w:t xml:space="preserve">DEMO-PR-EMERGENCY-ACCOUNTING</w:t>
+      </w:r>
+      <w:r>
+        <w:rPr>
+          <w:rFonts w:ascii="Times New Roman" w:cs="Times New Roman" w:eastAsia="Times New Roman" w:hAnsi="Times New Roman"/>
+          <w:sz w:val="22"/>
+          <w:szCs w:val="22"/>
+          <w:color w:val="1A1A1A"/>
+        </w:rPr>
+        <w:t xml:space="preserve"> (Stockroom · Reception Tent 10 × 20 m · short 1 · </w:t>
+      </w:r>
+      <w:r>
+        <w:rPr>
+          <w:rFonts w:ascii="Times New Roman" w:cs="Times New Roman" w:eastAsia="Times New Roman" w:hAnsi="Times New Roman"/>
+          <w:b/>
+          <w:bCs/>
+          <w:sz w:val="22"/>
+          <w:szCs w:val="22"/>
+          <w:color w:val="1A1A1A"/>
+        </w:rPr>
+        <w:t xml:space="preserve">rental</w:t>
+      </w:r>
+      <w:r>
+        <w:rPr>
+          <w:rFonts w:ascii="Times New Roman" w:cs="Times New Roman" w:eastAsia="Times New Roman" w:hAnsi="Times New Roman"/>
+          <w:sz w:val="22"/>
+          <w:szCs w:val="22"/>
+          <w:color w:val="1A1A1A"/>
+        </w:rPr>
+        <w:t xml:space="preserve">).</w:t>
+      </w:r>
+    </w:p>
+    <w:p>
+      <w:pPr>
+        <w:spacing w:after="80"/>
+        <w:ind w:left="480" w:hanging="360"/>
+      </w:pPr>
+      <w:r>
+        <w:rPr>
+          <w:rFonts w:ascii="Times New Roman" w:cs="Times New Roman" w:eastAsia="Times New Roman" w:hAnsi="Times New Roman"/>
+          <w:b/>
+          <w:bCs/>
+          <w:sz w:val="22"/>
+          <w:szCs w:val="22"/>
+          <w:color w:val="1A1A1A"/>
+        </w:rPr>
+        <w:t xml:space="preserve">5.</w:t>
+      </w:r>
+      <w:r>
+        <w:rPr>
+          <w:rFonts w:ascii="Times New Roman" w:cs="Times New Roman" w:eastAsia="Times New Roman" w:hAnsi="Times New Roman"/>
+          <w:sz w:val="22"/>
+          <w:szCs w:val="22"/>
+          <w:color w:val="1A1A1A"/>
+        </w:rPr>
+        <w:t xml:space="preserve"> Connect it back to Part 2: whichever route is chosen, the request reaches Accounting for the budget check before any money is released, and must respect the seven-day requisition lead time.</w:t>
+      </w:r>
+    </w:p>
+    <w:p>
+      <w:pPr>
+        <w:spacing w:before="80" w:after="160"/>
+        <w:ind w:left="120"/>
+        <w:pBdr>
+          <w:top w:val="single" w:sz="4" w:color="B08699"/>
+          <w:left w:val="single" w:sz="4" w:color="B08699"/>
+          <w:bottom w:val="single" w:sz="4" w:color="B08699"/>
+          <w:right w:val="single" w:sz="4" w:color="B08699"/>
+        </w:pBdr>
+        <w:shd w:val="clear" w:fill="FBF6F8"/>
+      </w:pPr>
+      <w:r>
+        <w:rPr>
+          <w:rFonts w:ascii="Times New Roman" w:cs="Times New Roman" w:eastAsia="Times New Roman" w:hAnsi="Times New Roman"/>
+          <w:b/>
+          <w:bCs/>
+          <w:color w:val="7A2E4A"/>
+          <w:sz w:val="20"/>
+          <w:szCs w:val="20"/>
+        </w:rPr>
+        <w:t xml:space="preserve">State accurately: </w:t>
+      </w:r>
+      <w:r>
+        <w:rPr>
+          <w:rFonts w:ascii="Times New Roman" w:cs="Times New Roman" w:eastAsia="Times New Roman" w:hAnsi="Times New Roman"/>
+          <w:color w:val="1A1A1A"/>
+          <w:sz w:val="20"/>
+          <w:szCs w:val="20"/>
+        </w:rPr>
+        <w:t xml:space="preserve">the requesting department chooses purchase or rental and the system records that choice; the “purchase first, rental second” preference is company practice, not a rule the system enforces.</w:t>
+      </w:r>
+    </w:p>
+    <w:p>
+      <w:pPr>
+        <w:pStyle w:val="Heading2"/>
+      </w:pPr>
+      <w:r>
+        <w:rPr>
+          <w:rFonts w:ascii="Times New Roman" w:cs="Times New Roman" w:eastAsia="Times New Roman" w:hAnsi="Times New Roman"/>
+          <w:b/>
+          <w:bCs/>
+          <w:color w:val="1A1A1A"/>
+          <w:sz w:val="28"/>
+          <w:szCs w:val="28"/>
+        </w:rPr>
+        <w:t xml:space="preserve">7.2 Scenario B — An Item Is Damaged During the Event</w:t>
+      </w:r>
+    </w:p>
+    <w:p>
+      <w:pPr>
+        <w:spacing w:after="140"/>
+        <w:ind w:left="360"/>
+      </w:pPr>
+      <w:r>
+        <w:rPr>
+          <w:rFonts w:ascii="Times New Roman" w:cs="Times New Roman" w:eastAsia="Times New Roman" w:hAnsi="Times New Roman"/>
+          <w:b/>
+          <w:bCs/>
+          <w:color w:val="5F5F5F"/>
+          <w:sz w:val="21"/>
+          <w:szCs w:val="21"/>
+        </w:rPr>
+        <w:t xml:space="preserve">Say: </w:t>
+      </w:r>
+      <w:r>
+        <w:rPr>
+          <w:rFonts w:ascii="Times New Roman" w:cs="Times New Roman" w:eastAsia="Times New Roman" w:hAnsi="Times New Roman"/>
+          <w:i/>
+          <w:iCs/>
+          <w:color w:val="3A3A3A"/>
+          <w:sz w:val="21"/>
+          <w:szCs w:val="21"/>
+        </w:rPr>
+        <w:t xml:space="preserve">“After an event, departments verify what came back. When something is damaged or missing, it is recorded against the contract rather than quietly written off.”</w:t>
+      </w:r>
+    </w:p>
+    <w:p>
+      <w:pPr>
+        <w:spacing w:after="80"/>
+        <w:ind w:left="480" w:hanging="360"/>
+      </w:pPr>
+      <w:r>
+        <w:rPr>
+          <w:rFonts w:ascii="Times New Roman" w:cs="Times New Roman" w:eastAsia="Times New Roman" w:hAnsi="Times New Roman"/>
+          <w:b/>
+          <w:bCs/>
+          <w:sz w:val="22"/>
+          <w:szCs w:val="22"/>
+          <w:color w:val="1A1A1A"/>
+        </w:rPr>
+        <w:t xml:space="preserve">1.</w:t>
+      </w:r>
+      <w:r>
+        <w:rPr>
+          <w:rFonts w:ascii="Times New Roman" w:cs="Times New Roman" w:eastAsia="Times New Roman" w:hAnsi="Times New Roman"/>
+          <w:sz w:val="22"/>
+          <w:szCs w:val="22"/>
+          <w:color w:val="1A1A1A"/>
+        </w:rPr>
+        <w:t xml:space="preserve"> Open the </w:t>
+      </w:r>
+      <w:r>
+        <w:rPr>
+          <w:rFonts w:ascii="Times New Roman" w:cs="Times New Roman" w:eastAsia="Times New Roman" w:hAnsi="Times New Roman"/>
+          <w:b/>
+          <w:bCs/>
+          <w:sz w:val="22"/>
+          <w:szCs w:val="22"/>
+          <w:color w:val="1A1A1A"/>
+        </w:rPr>
+        <w:t xml:space="preserve">Incidents</w:t>
+      </w:r>
+      <w:r>
+        <w:rPr>
+          <w:rFonts w:ascii="Times New Roman" w:cs="Times New Roman" w:eastAsia="Times New Roman" w:hAnsi="Times New Roman"/>
+          <w:sz w:val="22"/>
+          <w:szCs w:val="22"/>
+          <w:color w:val="1A1A1A"/>
+        </w:rPr>
+        <w:t xml:space="preserve"> page and show the register — damaged equipment, missing items, burnt cloth from food heaters, and food spoilage are all represented.</w:t>
+      </w:r>
+    </w:p>
+    <w:p>
+      <w:pPr>
+        <w:spacing w:after="80"/>
+        <w:ind w:left="480" w:hanging="360"/>
+      </w:pPr>
+      <w:r>
+        <w:rPr>
+          <w:rFonts w:ascii="Times New Roman" w:cs="Times New Roman" w:eastAsia="Times New Roman" w:hAnsi="Times New Roman"/>
+          <w:b/>
+          <w:bCs/>
+          <w:sz w:val="22"/>
+          <w:szCs w:val="22"/>
+          <w:color w:val="1A1A1A"/>
+        </w:rPr>
+        <w:t xml:space="preserve">2.</w:t>
+      </w:r>
+      <w:r>
+        <w:rPr>
+          <w:rFonts w:ascii="Times New Roman" w:cs="Times New Roman" w:eastAsia="Times New Roman" w:hAnsi="Times New Roman"/>
+          <w:sz w:val="22"/>
+          <w:szCs w:val="22"/>
+          <w:color w:val="1A1A1A"/>
+        </w:rPr>
+        <w:t xml:space="preserve"> Open an example such as the </w:t>
+      </w:r>
+      <w:r>
+        <w:rPr>
+          <w:rFonts w:ascii="Times New Roman" w:cs="Times New Roman" w:eastAsia="Times New Roman" w:hAnsi="Times New Roman"/>
+          <w:b/>
+          <w:bCs/>
+          <w:sz w:val="22"/>
+          <w:szCs w:val="22"/>
+          <w:color w:val="1A1A1A"/>
+        </w:rPr>
+        <w:t xml:space="preserve">damaged Gold Centerpiece Set</w:t>
+      </w:r>
+      <w:r>
+        <w:rPr>
+          <w:rFonts w:ascii="Times New Roman" w:cs="Times New Roman" w:eastAsia="Times New Roman" w:hAnsi="Times New Roman"/>
+          <w:sz w:val="22"/>
+          <w:szCs w:val="22"/>
+          <w:color w:val="1A1A1A"/>
+        </w:rPr>
+        <w:t xml:space="preserve"> or the </w:t>
+      </w:r>
+      <w:r>
+        <w:rPr>
+          <w:rFonts w:ascii="Times New Roman" w:cs="Times New Roman" w:eastAsia="Times New Roman" w:hAnsi="Times New Roman"/>
+          <w:b/>
+          <w:bCs/>
+          <w:sz w:val="22"/>
+          <w:szCs w:val="22"/>
+          <w:color w:val="1A1A1A"/>
+        </w:rPr>
+        <w:t xml:space="preserve">missing Portable PA System</w:t>
+      </w:r>
+      <w:r>
+        <w:rPr>
+          <w:rFonts w:ascii="Times New Roman" w:cs="Times New Roman" w:eastAsia="Times New Roman" w:hAnsi="Times New Roman"/>
+          <w:sz w:val="22"/>
+          <w:szCs w:val="22"/>
+          <w:color w:val="1A1A1A"/>
+        </w:rPr>
+        <w:t xml:space="preserve">, showing the type, severity, status, affected quantity, and optional photograph.</w:t>
+      </w:r>
+    </w:p>
+    <w:p>
+      <w:pPr>
+        <w:spacing w:after="80"/>
+        <w:ind w:left="480" w:hanging="360"/>
+      </w:pPr>
+      <w:r>
+        <w:rPr>
+          <w:rFonts w:ascii="Times New Roman" w:cs="Times New Roman" w:eastAsia="Times New Roman" w:hAnsi="Times New Roman"/>
+          <w:b/>
+          <w:bCs/>
+          <w:sz w:val="22"/>
+          <w:szCs w:val="22"/>
+          <w:color w:val="1A1A1A"/>
+        </w:rPr>
+        <w:t xml:space="preserve">3.</w:t>
+      </w:r>
+      <w:r>
+        <w:rPr>
+          <w:rFonts w:ascii="Times New Roman" w:cs="Times New Roman" w:eastAsia="Times New Roman" w:hAnsi="Times New Roman"/>
+          <w:sz w:val="22"/>
+          <w:szCs w:val="22"/>
+          <w:color w:val="1A1A1A"/>
+        </w:rPr>
+        <w:t xml:space="preserve"> Explain that during post-event checking a department clicks </w:t>
+      </w:r>
+      <w:r>
+        <w:rPr>
+          <w:rFonts w:ascii="Times New Roman" w:cs="Times New Roman" w:eastAsia="Times New Roman" w:hAnsi="Times New Roman"/>
+          <w:b/>
+          <w:bCs/>
+          <w:sz w:val="22"/>
+          <w:szCs w:val="22"/>
+          <w:color w:val="1A1A1A"/>
+        </w:rPr>
+        <w:t xml:space="preserve">Report Incident</w:t>
+      </w:r>
+      <w:r>
+        <w:rPr>
+          <w:rFonts w:ascii="Times New Roman" w:cs="Times New Roman" w:eastAsia="Times New Roman" w:hAnsi="Times New Roman"/>
+          <w:sz w:val="22"/>
+          <w:szCs w:val="22"/>
+          <w:color w:val="1A1A1A"/>
+        </w:rPr>
+        <w:t xml:space="preserve"> on the item instead of marking it returned; the contract and item are filled in automatically.</w:t>
+      </w:r>
+    </w:p>
+    <w:p>
+      <w:pPr>
+        <w:spacing w:after="80"/>
+        <w:ind w:left="480" w:hanging="360"/>
+      </w:pPr>
+      <w:r>
+        <w:rPr>
+          <w:rFonts w:ascii="Times New Roman" w:cs="Times New Roman" w:eastAsia="Times New Roman" w:hAnsi="Times New Roman"/>
+          <w:b/>
+          <w:bCs/>
+          <w:sz w:val="22"/>
+          <w:szCs w:val="22"/>
+          <w:color w:val="1A1A1A"/>
+        </w:rPr>
+        <w:t xml:space="preserve">4.</w:t>
+      </w:r>
+      <w:r>
+        <w:rPr>
+          <w:rFonts w:ascii="Times New Roman" w:cs="Times New Roman" w:eastAsia="Times New Roman" w:hAnsi="Times New Roman"/>
+          <w:sz w:val="22"/>
+          <w:szCs w:val="22"/>
+          <w:color w:val="1A1A1A"/>
+        </w:rPr>
+        <w:t xml:space="preserve"> Note the accountability rule: the variance carries into the missing-and-damaged summary, and unresolved losses may be charged unless the supervisor files a valid counter-report.</w:t>
+      </w:r>
+    </w:p>
+    <w:p>
+      <w:pPr>
+        <w:spacing w:after="80"/>
+        <w:ind w:left="480" w:hanging="360"/>
+      </w:pPr>
+      <w:r>
+        <w:rPr>
+          <w:rFonts w:ascii="Times New Roman" w:cs="Times New Roman" w:eastAsia="Times New Roman" w:hAnsi="Times New Roman"/>
+          <w:b/>
+          <w:bCs/>
+          <w:sz w:val="22"/>
+          <w:szCs w:val="22"/>
+          <w:color w:val="1A1A1A"/>
+        </w:rPr>
+        <w:t xml:space="preserve">5.</w:t>
+      </w:r>
+      <w:r>
+        <w:rPr>
+          <w:rFonts w:ascii="Times New Roman" w:cs="Times New Roman" w:eastAsia="Times New Roman" w:hAnsi="Times New Roman"/>
+          <w:sz w:val="22"/>
+          <w:szCs w:val="22"/>
+          <w:color w:val="1A1A1A"/>
+        </w:rPr>
+        <w:t xml:space="preserve"> Connect it back to Part 3: incidents appear in the department reports, so management sees them without asking.</w:t>
+      </w:r>
+    </w:p>
+    <w:p>
+      <w:pPr>
+        <w:pStyle w:val="Heading2"/>
+      </w:pPr>
+      <w:r>
+        <w:rPr>
+          <w:rFonts w:ascii="Times New Roman" w:cs="Times New Roman" w:eastAsia="Times New Roman" w:hAnsi="Times New Roman"/>
+          <w:b/>
+          <w:bCs/>
+          <w:color w:val="1A1A1A"/>
+          <w:sz w:val="28"/>
+          <w:szCs w:val="28"/>
+        </w:rPr>
+        <w:t xml:space="preserve">7.3 Scenarios Already Covered Earlier</w:t>
+      </w:r>
+    </w:p>
+    <w:p>
+      <w:pPr>
+        <w:spacing w:after="160"/>
+      </w:pPr>
+      <w:r>
+        <w:rPr>
+          <w:rFonts w:ascii="Times New Roman" w:cs="Times New Roman" w:eastAsia="Times New Roman" w:hAnsi="Times New Roman"/>
+          <w:sz w:val="22"/>
+          <w:szCs w:val="22"/>
+          <w:color w:val="1A1A1A"/>
+        </w:rPr>
+        <w:t xml:space="preserve">Two of the operational scenarios have already been demonstrated and do not need repeating:</w:t>
+      </w:r>
+    </w:p>
+    <w:p>
+      <w:pPr>
+        <w:spacing w:after="80"/>
+        <w:ind w:left="480" w:hanging="360"/>
+      </w:pPr>
+      <w:r>
+        <w:rPr>
+          <w:rFonts w:ascii="Times New Roman" w:cs="Times New Roman" w:eastAsia="Times New Roman" w:hAnsi="Times New Roman"/>
+          <w:sz w:val="22"/>
+          <w:szCs w:val="22"/>
+          <w:color w:val="1A1A1A"/>
+        </w:rPr>
+        <w:t xml:space="preserve">•  </w:t>
+      </w:r>
+      <w:r>
+        <w:rPr>
+          <w:rFonts w:ascii="Times New Roman" w:cs="Times New Roman" w:eastAsia="Times New Roman" w:hAnsi="Times New Roman"/>
+          <w:b/>
+          <w:bCs/>
+          <w:sz w:val="22"/>
+          <w:szCs w:val="22"/>
+          <w:color w:val="1A1A1A"/>
+        </w:rPr>
+        <w:t xml:space="preserve">A contract with a late payment</w:t>
+      </w:r>
+      <w:r>
+        <w:rPr>
+          <w:rFonts w:ascii="Times New Roman" w:cs="Times New Roman" w:eastAsia="Times New Roman" w:hAnsi="Times New Roman"/>
+          <w:sz w:val="22"/>
+          <w:szCs w:val="22"/>
+          <w:color w:val="1A1A1A"/>
+        </w:rPr>
+        <w:t xml:space="preserve"> — the automatic hold, the notifications that precede it, and its release were shown in Part 4 (§4.6).</w:t>
+      </w:r>
+    </w:p>
+    <w:p>
+      <w:pPr>
+        <w:spacing w:after="80"/>
+        <w:ind w:left="480" w:hanging="360"/>
+      </w:pPr>
+      <w:r>
+        <w:rPr>
+          <w:rFonts w:ascii="Times New Roman" w:cs="Times New Roman" w:eastAsia="Times New Roman" w:hAnsi="Times New Roman"/>
+          <w:sz w:val="22"/>
+          <w:szCs w:val="22"/>
+          <w:color w:val="1A1A1A"/>
+        </w:rPr>
+        <w:t xml:space="preserve">•  </w:t>
+      </w:r>
+      <w:r>
+        <w:rPr>
+          <w:rFonts w:ascii="Times New Roman" w:cs="Times New Roman" w:eastAsia="Times New Roman" w:hAnsi="Times New Roman"/>
+          <w:b/>
+          <w:bCs/>
+          <w:sz w:val="22"/>
+          <w:szCs w:val="22"/>
+          <w:color w:val="1A1A1A"/>
+        </w:rPr>
+        <w:t xml:space="preserve">A budget request rejected by Accounting</w:t>
+      </w:r>
+      <w:r>
+        <w:rPr>
+          <w:rFonts w:ascii="Times New Roman" w:cs="Times New Roman" w:eastAsia="Times New Roman" w:hAnsi="Times New Roman"/>
+          <w:sz w:val="22"/>
+          <w:szCs w:val="22"/>
+          <w:color w:val="1A1A1A"/>
+        </w:rPr>
+        <w:t xml:space="preserve"> — the block and the return-with-reason round trip were shown in Part 2 (§4.7).</w:t>
+      </w:r>
+    </w:p>
+    <w:p>
+      <w:pPr>
+        <w:pStyle w:val="Heading1"/>
+        <w:pageBreakBefore/>
+      </w:pPr>
+      <w:r>
+        <w:rPr>
+          <w:rFonts w:ascii="Times New Roman" w:cs="Times New Roman" w:eastAsia="Times New Roman" w:hAnsi="Times New Roman"/>
+          <w:b/>
+          <w:bCs/>
+          <w:color w:val="491321"/>
+          <w:sz w:val="40"/>
+          <w:szCs w:val="40"/>
+        </w:rPr>
+        <w:t xml:space="preserve">8. Revisions Demonstrated</w:t>
+      </w:r>
+    </w:p>
+    <w:p>
+      <w:pPr>
+        <w:spacing w:after="160"/>
+      </w:pPr>
+      <w:r>
+        <w:rPr>
+          <w:rFonts w:ascii="Times New Roman" w:cs="Times New Roman" w:eastAsia="Times New Roman" w:hAnsi="Times New Roman"/>
+          <w:sz w:val="22"/>
+          <w:szCs w:val="22"/>
+          <w:color w:val="1A1A1A"/>
+        </w:rPr>
+        <w:t xml:space="preserve">The revisions below are the ones visible during this demonstration. They are drawn from the two-week development cycle of 22 to 29 July 2026.</w:t>
+      </w:r>
+    </w:p>
+    <w:p>
+      <w:pPr>
+        <w:pStyle w:val="Heading2"/>
+      </w:pPr>
+      <w:r>
+        <w:rPr>
+          <w:rFonts w:ascii="Times New Roman" w:cs="Times New Roman" w:eastAsia="Times New Roman" w:hAnsi="Times New Roman"/>
+          <w:b/>
+          <w:bCs/>
+          <w:color w:val="1A1A1A"/>
+          <w:sz w:val="28"/>
+          <w:szCs w:val="28"/>
+        </w:rPr>
+        <w:t xml:space="preserve">8.1 Revisions Shown Directly</w:t>
       </w:r>
     </w:p>
     <w:p>
@@ -3475,7 +4390,7 @@
           <w:sz w:val="20"/>
           <w:szCs w:val="20"/>
         </w:rPr>
-        <w:t xml:space="preserve">Table 7.1 Revisions Demonstrated in Each Part</w:t>
+        <w:t xml:space="preserve">Table 8.1 Revisions Demonstrated in Each Part</w:t>
       </w:r>
     </w:p>
     <w:tbl>
@@ -4448,7 +5363,7 @@
           <w:sz w:val="28"/>
           <w:szCs w:val="28"/>
         </w:rPr>
-        <w:t xml:space="preserve">7.2 Revisions Visible Throughout</w:t>
+        <w:t xml:space="preserve">8.2 Revisions Visible Throughout</w:t>
       </w:r>
     </w:p>
     <w:p>
@@ -4478,7 +5393,7 @@
           <w:sz w:val="20"/>
           <w:szCs w:val="20"/>
         </w:rPr>
-        <w:t xml:space="preserve">Table 7.2 Revisions Visible Throughout the Demonstration</w:t>
+        <w:t xml:space="preserve">Table 8.2 Revisions Visible Throughout the Demonstration</w:t>
       </w:r>
     </w:p>
     <w:tbl>
@@ -4991,7 +5906,7 @@
           <w:sz w:val="28"/>
           <w:szCs w:val="28"/>
         </w:rPr>
-        <w:t xml:space="preserve">7.3 Revisions Not Demonstrated but Available if Raised</w:t>
+        <w:t xml:space="preserve">8.3 Revisions Not Demonstrated but Available if Raised</w:t>
       </w:r>
     </w:p>
     <w:p>
@@ -5162,7 +6077,7 @@
           <w:sz w:val="40"/>
           <w:szCs w:val="40"/>
         </w:rPr>
-        <w:t xml:space="preserve">8. Anticipated Questions</w:t>
+        <w:t xml:space="preserve">9. Anticipated Questions</w:t>
       </w:r>
     </w:p>
     <w:p>
@@ -5178,7 +6093,7 @@
           <w:sz w:val="20"/>
           <w:szCs w:val="20"/>
         </w:rPr>
-        <w:t xml:space="preserve">Table 8.1 Anticipated Questions and Where to Answer From</w:t>
+        <w:t xml:space="preserve">Table 9.1 Anticipated Questions and Where to Answer From</w:t>
       </w:r>
     </w:p>
     <w:tbl>
@@ -5923,7 +6838,7 @@
           <w:sz w:val="40"/>
           <w:szCs w:val="40"/>
         </w:rPr>
-        <w:t xml:space="preserve">9. Timing</w:t>
+        <w:t xml:space="preserve">10. Timing</w:t>
       </w:r>
     </w:p>
     <w:p>
@@ -5939,7 +6854,7 @@
           <w:sz w:val="20"/>
           <w:szCs w:val="20"/>
         </w:rPr>
-        <w:t xml:space="preserve">Table 9.1 Indicative Timing</w:t>
+        <w:t xml:space="preserve">Table 10.1 Indicative Timing</w:t>
       </w:r>
     </w:p>
     <w:tbl>
@@ -6455,7 +7370,7 @@
                 <w:sz w:val="19"/>
                 <w:szCs w:val="19"/>
               </w:rPr>
-              <w:t xml:space="preserve">Questions</w:t>
+              <w:t xml:space="preserve">Part 5 — Scenario spotlights</w:t>
             </w:r>
           </w:p>
         </w:tc>
@@ -6480,7 +7395,7 @@
                 <w:sz w:val="19"/>
                 <w:szCs w:val="19"/>
               </w:rPr>
-              <w:t xml:space="preserve">Remaining time</w:t>
+              <w:t xml:space="preserve">3 minutes</w:t>
             </w:r>
           </w:p>
         </w:tc>
@@ -6505,7 +7420,7 @@
                 <w:sz w:val="19"/>
                 <w:szCs w:val="19"/>
               </w:rPr>
-              <w:t xml:space="preserve">Table 8.1</w:t>
+              <w:t xml:space="preserve">§11.3 · §13.3</w:t>
             </w:r>
           </w:p>
         </w:tc>
@@ -6532,6 +7447,83 @@
                 <w:sz w:val="19"/>
                 <w:szCs w:val="19"/>
               </w:rPr>
+              <w:t xml:space="preserve">Questions</w:t>
+            </w:r>
+          </w:p>
+        </w:tc>
+        <w:tc>
+          <w:tcPr>
+            <w:tcW w:type="dxa" w:w="2400"/>
+            <w:tcMar>
+              <w:top w:type="dxa" w:w="60"/>
+              <w:left w:type="dxa" w:w="90"/>
+              <w:bottom w:type="dxa" w:w="60"/>
+              <w:right w:type="dxa" w:w="90"/>
+            </w:tcMar>
+          </w:tcPr>
+          <w:p>
+            <w:pPr>
+              <w:spacing w:after="0" w:line="252"/>
+            </w:pPr>
+            <w:r>
+              <w:rPr>
+                <w:rFonts w:ascii="Times New Roman" w:cs="Times New Roman" w:eastAsia="Times New Roman" w:hAnsi="Times New Roman"/>
+                <w:color w:val="1A1A1A"/>
+                <w:sz w:val="19"/>
+                <w:szCs w:val="19"/>
+              </w:rPr>
+              <w:t xml:space="preserve">Remaining time</w:t>
+            </w:r>
+          </w:p>
+        </w:tc>
+        <w:tc>
+          <w:tcPr>
+            <w:tcW w:type="dxa" w:w="2300"/>
+            <w:tcMar>
+              <w:top w:type="dxa" w:w="60"/>
+              <w:left w:type="dxa" w:w="90"/>
+              <w:bottom w:type="dxa" w:w="60"/>
+              <w:right w:type="dxa" w:w="90"/>
+            </w:tcMar>
+          </w:tcPr>
+          <w:p>
+            <w:pPr>
+              <w:spacing w:after="0" w:line="252"/>
+            </w:pPr>
+            <w:r>
+              <w:rPr>
+                <w:rFonts w:ascii="Times New Roman" w:cs="Times New Roman" w:eastAsia="Times New Roman" w:hAnsi="Times New Roman"/>
+                <w:color w:val="1A1A1A"/>
+                <w:sz w:val="19"/>
+                <w:szCs w:val="19"/>
+              </w:rPr>
+              <w:t xml:space="preserve">Table 9.1</w:t>
+            </w:r>
+          </w:p>
+        </w:tc>
+      </w:tr>
+      <w:tr>
+        <w:tc>
+          <w:tcPr>
+            <w:tcW w:type="dxa" w:w="4700"/>
+            <w:tcMar>
+              <w:top w:type="dxa" w:w="60"/>
+              <w:left w:type="dxa" w:w="90"/>
+              <w:bottom w:type="dxa" w:w="60"/>
+              <w:right w:type="dxa" w:w="90"/>
+            </w:tcMar>
+          </w:tcPr>
+          <w:p>
+            <w:pPr>
+              <w:spacing w:after="0" w:line="252"/>
+            </w:pPr>
+            <w:r>
+              <w:rPr>
+                <w:rFonts w:ascii="Times New Roman" w:cs="Times New Roman" w:eastAsia="Times New Roman" w:hAnsi="Times New Roman"/>
+                <w:color w:val="1A1A1A"/>
+                <w:sz w:val="19"/>
+                <w:szCs w:val="19"/>
+              </w:rPr>
               <w:t xml:space="preserve">Total demonstration</w:t>
             </w:r>
           </w:p>
@@ -6557,7 +7549,7 @@
                 <w:sz w:val="19"/>
                 <w:szCs w:val="19"/>
               </w:rPr>
-              <w:t xml:space="preserve">Approximately 12 minutes</w:t>
+              <w:t xml:space="preserve">Approximately 15 minutes</w:t>
             </w:r>
           </w:p>
         </w:tc>

</xml_diff>

<commit_message>
docs: demo outline navigation cues; user manual with populated TOC
- Demo outline: each segment now opens with an "Announce to the panel" box
  naming the manual section to turn to (6 cues: opening Ch.4/§4.1 + one per Part)
- User manual: TOC field populated from opening in Word

Co-Authored-By: Claude Opus 4.8 <noreply@anthropic.com>
</commit_message>
<xml_diff>
--- a/docs/Demo-Outline-Accounting-and-Reports.docx
+++ b/docs/Demo-Outline-Accounting-and-Reports.docx
@@ -353,6 +353,54 @@
           <w:szCs w:val="21"/>
         </w:rPr>
         <w:t xml:space="preserve">“Since the contract lifecycle was covered in our last defense, we are focusing on the two modules that were not: how Accounting sets and enforces its operating budget, and what the system reports back. We will be following Chapter 4 and Chapter 13 of the user manual.”</w:t>
+      </w:r>
+    </w:p>
+    <w:p>
+      <w:pPr>
+        <w:spacing w:before="120" w:after="60"/>
+        <w:ind w:left="120"/>
+        <w:pBdr>
+          <w:top w:val="single" w:sz="12" w:space="4" w:color="491321"/>
+          <w:left w:val="single" w:sz="12" w:space="6" w:color="491321"/>
+          <w:bottom w:val="single" w:sz="12" w:space="4" w:color="491321"/>
+          <w:right w:val="single" w:sz="12" w:space="6" w:color="491321"/>
+        </w:pBdr>
+        <w:shd w:val="clear" w:fill="F2E8ED"/>
+      </w:pPr>
+      <w:r>
+        <w:rPr>
+          <w:rFonts w:ascii="Times New Roman" w:cs="Times New Roman" w:eastAsia="Times New Roman" w:hAnsi="Times New Roman"/>
+          <w:b/>
+          <w:bCs/>
+          <w:caps/>
+          <w:color w:val="491321"/>
+          <w:sz w:val="19"/>
+          <w:szCs w:val="19"/>
+        </w:rPr>
+        <w:t xml:space="preserve">Announce to the panel</w:t>
+      </w:r>
+    </w:p>
+    <w:p>
+      <w:pPr>
+        <w:spacing w:after="160"/>
+        <w:ind w:left="120"/>
+        <w:pBdr>
+          <w:left w:val="single" w:sz="12" w:space="6" w:color="491321"/>
+          <w:bottom w:val="single" w:sz="12" w:space="4" w:color="491321"/>
+          <w:right w:val="single" w:sz="12" w:space="6" w:color="491321"/>
+        </w:pBdr>
+        <w:shd w:val="clear" w:fill="F2E8ED"/>
+      </w:pPr>
+      <w:r>
+        <w:rPr>
+          <w:rFonts w:ascii="Times New Roman" w:cs="Times New Roman" w:eastAsia="Times New Roman" w:hAnsi="Times New Roman"/>
+          <w:i/>
+          <w:iCs/>
+          <w:color w:val="1A1A1A"/>
+          <w:sz w:val="22"/>
+          <w:szCs w:val="22"/>
+        </w:rPr>
+        <w:t xml:space="preserve">“May we ask the panel to open the User Manual at Chapter 4, the Accounting Department Guide. Section 4.1 gives the department’s features at a glance in Table 4.1, and this demonstration is based on that chapter together with Chapter 13 on Reports. We will announce the section before each part.”</w:t>
       </w:r>
     </w:p>
     <w:p>
@@ -1608,6 +1656,54 @@
     </w:p>
     <w:p>
       <w:pPr>
+        <w:spacing w:before="120" w:after="60"/>
+        <w:ind w:left="120"/>
+        <w:pBdr>
+          <w:top w:val="single" w:sz="12" w:space="4" w:color="491321"/>
+          <w:left w:val="single" w:sz="12" w:space="6" w:color="491321"/>
+          <w:bottom w:val="single" w:sz="12" w:space="4" w:color="491321"/>
+          <w:right w:val="single" w:sz="12" w:space="6" w:color="491321"/>
+        </w:pBdr>
+        <w:shd w:val="clear" w:fill="F2E8ED"/>
+      </w:pPr>
+      <w:r>
+        <w:rPr>
+          <w:rFonts w:ascii="Times New Roman" w:cs="Times New Roman" w:eastAsia="Times New Roman" w:hAnsi="Times New Roman"/>
+          <w:b/>
+          <w:bCs/>
+          <w:caps/>
+          <w:color w:val="491321"/>
+          <w:sz w:val="19"/>
+          <w:szCs w:val="19"/>
+        </w:rPr>
+        <w:t xml:space="preserve">Announce to the panel</w:t>
+      </w:r>
+    </w:p>
+    <w:p>
+      <w:pPr>
+        <w:spacing w:after="160"/>
+        <w:ind w:left="120"/>
+        <w:pBdr>
+          <w:left w:val="single" w:sz="12" w:space="6" w:color="491321"/>
+          <w:bottom w:val="single" w:sz="12" w:space="4" w:color="491321"/>
+          <w:right w:val="single" w:sz="12" w:space="6" w:color="491321"/>
+        </w:pBdr>
+        <w:shd w:val="clear" w:fill="F2E8ED"/>
+      </w:pPr>
+      <w:r>
+        <w:rPr>
+          <w:rFonts w:ascii="Times New Roman" w:cs="Times New Roman" w:eastAsia="Times New Roman" w:hAnsi="Times New Roman"/>
+          <w:i/>
+          <w:iCs/>
+          <w:color w:val="1A1A1A"/>
+          <w:sz w:val="22"/>
+          <w:szCs w:val="22"/>
+        </w:rPr>
+        <w:t xml:space="preserve">“Please navigate to Section 4.8 of the User Manual, Monthly Operating Budget. This segment is based on that section, and Figure 4.8.1 shows the screen we are about to open.”</w:t>
+      </w:r>
+    </w:p>
+    <w:p>
+      <w:pPr>
         <w:spacing w:before="80" w:after="160"/>
         <w:ind w:left="120"/>
         <w:pBdr>
@@ -2090,6 +2186,54 @@
     </w:p>
     <w:p>
       <w:pPr>
+        <w:spacing w:before="120" w:after="60"/>
+        <w:ind w:left="120"/>
+        <w:pBdr>
+          <w:top w:val="single" w:sz="12" w:space="4" w:color="491321"/>
+          <w:left w:val="single" w:sz="12" w:space="6" w:color="491321"/>
+          <w:bottom w:val="single" w:sz="12" w:space="4" w:color="491321"/>
+          <w:right w:val="single" w:sz="12" w:space="6" w:color="491321"/>
+        </w:pBdr>
+        <w:shd w:val="clear" w:fill="F2E8ED"/>
+      </w:pPr>
+      <w:r>
+        <w:rPr>
+          <w:rFonts w:ascii="Times New Roman" w:cs="Times New Roman" w:eastAsia="Times New Roman" w:hAnsi="Times New Roman"/>
+          <w:b/>
+          <w:bCs/>
+          <w:caps/>
+          <w:color w:val="491321"/>
+          <w:sz w:val="19"/>
+          <w:szCs w:val="19"/>
+        </w:rPr>
+        <w:t xml:space="preserve">Announce to the panel</w:t>
+      </w:r>
+    </w:p>
+    <w:p>
+      <w:pPr>
+        <w:spacing w:after="160"/>
+        <w:ind w:left="120"/>
+        <w:pBdr>
+          <w:left w:val="single" w:sz="12" w:space="6" w:color="491321"/>
+          <w:bottom w:val="single" w:sz="12" w:space="4" w:color="491321"/>
+          <w:right w:val="single" w:sz="12" w:space="6" w:color="491321"/>
+        </w:pBdr>
+        <w:shd w:val="clear" w:fill="F2E8ED"/>
+      </w:pPr>
+      <w:r>
+        <w:rPr>
+          <w:rFonts w:ascii="Times New Roman" w:cs="Times New Roman" w:eastAsia="Times New Roman" w:hAnsi="Times New Roman"/>
+          <w:i/>
+          <w:iCs/>
+          <w:color w:val="1A1A1A"/>
+          <w:sz w:val="22"/>
+          <w:szCs w:val="22"/>
+        </w:rPr>
+        <w:t xml:space="preserve">“Please navigate to Section 4.7, Procurement Budget Approval. This segment is based on that section. Figure 4.7.1 shows the approval queue, and Table 4.3 lists the financial business rules the system is enforcing.”</w:t>
+      </w:r>
+    </w:p>
+    <w:p>
+      <w:pPr>
         <w:spacing w:before="80" w:after="160"/>
         <w:ind w:left="120"/>
         <w:pBdr>
@@ -2620,6 +2764,54 @@
     </w:p>
     <w:p>
       <w:pPr>
+        <w:spacing w:before="120" w:after="60"/>
+        <w:ind w:left="120"/>
+        <w:pBdr>
+          <w:top w:val="single" w:sz="12" w:space="4" w:color="491321"/>
+          <w:left w:val="single" w:sz="12" w:space="6" w:color="491321"/>
+          <w:bottom w:val="single" w:sz="12" w:space="4" w:color="491321"/>
+          <w:right w:val="single" w:sz="12" w:space="6" w:color="491321"/>
+        </w:pBdr>
+        <w:shd w:val="clear" w:fill="F2E8ED"/>
+      </w:pPr>
+      <w:r>
+        <w:rPr>
+          <w:rFonts w:ascii="Times New Roman" w:cs="Times New Roman" w:eastAsia="Times New Roman" w:hAnsi="Times New Roman"/>
+          <w:b/>
+          <w:bCs/>
+          <w:caps/>
+          <w:color w:val="491321"/>
+          <w:sz w:val="19"/>
+          <w:szCs w:val="19"/>
+        </w:rPr>
+        <w:t xml:space="preserve">Announce to the panel</w:t>
+      </w:r>
+    </w:p>
+    <w:p>
+      <w:pPr>
+        <w:spacing w:after="160"/>
+        <w:ind w:left="120"/>
+        <w:pBdr>
+          <w:left w:val="single" w:sz="12" w:space="6" w:color="491321"/>
+          <w:bottom w:val="single" w:sz="12" w:space="4" w:color="491321"/>
+          <w:right w:val="single" w:sz="12" w:space="6" w:color="491321"/>
+        </w:pBdr>
+        <w:shd w:val="clear" w:fill="F2E8ED"/>
+      </w:pPr>
+      <w:r>
+        <w:rPr>
+          <w:rFonts w:ascii="Times New Roman" w:cs="Times New Roman" w:eastAsia="Times New Roman" w:hAnsi="Times New Roman"/>
+          <w:i/>
+          <w:iCs/>
+          <w:color w:val="1A1A1A"/>
+          <w:sz w:val="22"/>
+          <w:szCs w:val="22"/>
+        </w:rPr>
+        <w:t xml:space="preserve">“Please navigate to Chapter 13, Section 13.1, Department Reports. This segment is based on that section. Table 13.1 lists what every role receives, and Figure 13.1.1 shows the Reports page we are opening now.”</w:t>
+      </w:r>
+    </w:p>
+    <w:p>
+      <w:pPr>
         <w:spacing w:before="80" w:after="160"/>
         <w:ind w:left="120"/>
         <w:pBdr>
@@ -3168,6 +3360,54 @@
     </w:p>
     <w:p>
       <w:pPr>
+        <w:spacing w:before="120" w:after="60"/>
+        <w:ind w:left="120"/>
+        <w:pBdr>
+          <w:top w:val="single" w:sz="12" w:space="4" w:color="491321"/>
+          <w:left w:val="single" w:sz="12" w:space="6" w:color="491321"/>
+          <w:bottom w:val="single" w:sz="12" w:space="4" w:color="491321"/>
+          <w:right w:val="single" w:sz="12" w:space="6" w:color="491321"/>
+        </w:pBdr>
+        <w:shd w:val="clear" w:fill="F2E8ED"/>
+      </w:pPr>
+      <w:r>
+        <w:rPr>
+          <w:rFonts w:ascii="Times New Roman" w:cs="Times New Roman" w:eastAsia="Times New Roman" w:hAnsi="Times New Roman"/>
+          <w:b/>
+          <w:bCs/>
+          <w:caps/>
+          <w:color w:val="491321"/>
+          <w:sz w:val="19"/>
+          <w:szCs w:val="19"/>
+        </w:rPr>
+        <w:t xml:space="preserve">Announce to the panel</w:t>
+      </w:r>
+    </w:p>
+    <w:p>
+      <w:pPr>
+        <w:spacing w:after="160"/>
+        <w:ind w:left="120"/>
+        <w:pBdr>
+          <w:left w:val="single" w:sz="12" w:space="6" w:color="491321"/>
+          <w:bottom w:val="single" w:sz="12" w:space="4" w:color="491321"/>
+          <w:right w:val="single" w:sz="12" w:space="6" w:color="491321"/>
+        </w:pBdr>
+        <w:shd w:val="clear" w:fill="F2E8ED"/>
+      </w:pPr>
+      <w:r>
+        <w:rPr>
+          <w:rFonts w:ascii="Times New Roman" w:cs="Times New Roman" w:eastAsia="Times New Roman" w:hAnsi="Times New Roman"/>
+          <w:i/>
+          <w:iCs/>
+          <w:color w:val="1A1A1A"/>
+          <w:sz w:val="22"/>
+          <w:szCs w:val="22"/>
+        </w:rPr>
+        <w:t xml:space="preserve">“Please navigate back to Chapter 4, Sections 4.6 and 4.9 — Payment Holds and Closing the Contract. The scenarios themselves are listed in Section 4.10, and the timing rules behind them are in Appendix A, Table A.1.”</w:t>
+      </w:r>
+    </w:p>
+    <w:p>
+      <w:pPr>
         <w:spacing w:before="80" w:after="160"/>
         <w:ind w:left="120"/>
         <w:pBdr>
@@ -3532,6 +3772,54 @@
           <w:szCs w:val="40"/>
         </w:rPr>
         <w:t xml:space="preserve">7. Part 5 — Scenario Spotlights</w:t>
+      </w:r>
+    </w:p>
+    <w:p>
+      <w:pPr>
+        <w:spacing w:before="120" w:after="60"/>
+        <w:ind w:left="120"/>
+        <w:pBdr>
+          <w:top w:val="single" w:sz="12" w:space="4" w:color="491321"/>
+          <w:left w:val="single" w:sz="12" w:space="6" w:color="491321"/>
+          <w:bottom w:val="single" w:sz="12" w:space="4" w:color="491321"/>
+          <w:right w:val="single" w:sz="12" w:space="6" w:color="491321"/>
+        </w:pBdr>
+        <w:shd w:val="clear" w:fill="F2E8ED"/>
+      </w:pPr>
+      <w:r>
+        <w:rPr>
+          <w:rFonts w:ascii="Times New Roman" w:cs="Times New Roman" w:eastAsia="Times New Roman" w:hAnsi="Times New Roman"/>
+          <w:b/>
+          <w:bCs/>
+          <w:caps/>
+          <w:color w:val="491321"/>
+          <w:sz w:val="19"/>
+          <w:szCs w:val="19"/>
+        </w:rPr>
+        <w:t xml:space="preserve">Announce to the panel</w:t>
+      </w:r>
+    </w:p>
+    <w:p>
+      <w:pPr>
+        <w:spacing w:after="160"/>
+        <w:ind w:left="120"/>
+        <w:pBdr>
+          <w:left w:val="single" w:sz="12" w:space="6" w:color="491321"/>
+          <w:bottom w:val="single" w:sz="12" w:space="4" w:color="491321"/>
+          <w:right w:val="single" w:sz="12" w:space="6" w:color="491321"/>
+        </w:pBdr>
+        <w:shd w:val="clear" w:fill="F2E8ED"/>
+      </w:pPr>
+      <w:r>
+        <w:rPr>
+          <w:rFonts w:ascii="Times New Roman" w:cs="Times New Roman" w:eastAsia="Times New Roman" w:hAnsi="Times New Roman"/>
+          <w:i/>
+          <w:iCs/>
+          <w:color w:val="1A1A1A"/>
+          <w:sz w:val="22"/>
+          <w:szCs w:val="22"/>
+        </w:rPr>
+        <w:t xml:space="preserve">“For this last part, please navigate to Section 13.3, Incidents. The two scenarios we are showing are also written up in the department chapters — Sections 5.7, 6.7, and 7.8 for the inventory departments, and Section 11.3 for how Purchasing processes the resulting request.”</w:t>
       </w:r>
     </w:p>
     <w:p>

</xml_diff>

<commit_message>
Add demo kit seed and spoken demonstration script
Adds server/seedDemoKit.js (npm run seed:demokit), which prepares every
record the defense demonstration needs under a DK- prefix: six months of
collections history, aged receivables, a contract on payment hold, a
contract awaiting close, a same-day event pair, nine historical
procurement requests as the budget-suggestion basis, the current month's
budget, and four live requests — one that approves within budget and one
that is genuinely over the Creative allocation, so the block happens on
its own.

Adds docs/Demo-Script.docx, the word-for-word spoken script matching the
outline, and updates the outline's pre-demonstration checklist and record
numbers to the seeded ones. The manual step of temporarily lowering the
Creative allocation is no longer needed.

Co-Authored-By: Claude <noreply@anthropic.com>
</commit_message>
<xml_diff>
--- a/docs/Demo-Outline-Accounting-and-Reports.docx
+++ b/docs/Demo-Outline-Accounting-and-Reports.docx
@@ -1358,7 +1358,7 @@
           <w:szCs w:val="22"/>
           <w:color w:val="1A1A1A"/>
         </w:rPr>
-        <w:t xml:space="preserve"> Start the system. The backend runs on port 5000 and the interface on port 5173.</w:t>
+        <w:t xml:space="preserve"> Start the system with `npm run dev`. The backend runs on port 5000 and the interface on port 5173.</w:t>
       </w:r>
     </w:p>
     <w:p>
@@ -1384,27 +1384,7 @@
           <w:szCs w:val="22"/>
           <w:color w:val="1A1A1A"/>
         </w:rPr>
-        <w:t xml:space="preserve"> Log in with the </w:t>
-      </w:r>
-      <w:r>
-        <w:rPr>
-          <w:rFonts w:ascii="Times New Roman" w:cs="Times New Roman" w:eastAsia="Times New Roman" w:hAnsi="Times New Roman"/>
-          <w:b/>
-          <w:bCs/>
-          <w:sz w:val="22"/>
-          <w:szCs w:val="22"/>
-          <w:color w:val="1A1A1A"/>
-        </w:rPr>
-        <w:t xml:space="preserve">Accounting</w:t>
-      </w:r>
-      <w:r>
-        <w:rPr>
-          <w:rFonts w:ascii="Times New Roman" w:cs="Times New Roman" w:eastAsia="Times New Roman" w:hAnsi="Times New Roman"/>
-          <w:sz w:val="22"/>
-          <w:szCs w:val="22"/>
-          <w:color w:val="1A1A1A"/>
-        </w:rPr>
-        <w:t xml:space="preserve"> account. The entire demonstration is performed in this role.</w:t>
+        <w:t xml:space="preserve"> Run the demonstration kit: `npm run seed:demokit`. This prepares every record used below and may be re-run as often as needed.</w:t>
       </w:r>
     </w:p>
     <w:p>
@@ -1430,27 +1410,27 @@
           <w:szCs w:val="22"/>
           <w:color w:val="1A1A1A"/>
         </w:rPr>
-        <w:t xml:space="preserve"> Confirm the </w:t>
-      </w:r>
-      <w:r>
-        <w:rPr>
-          <w:rFonts w:ascii="Times New Roman" w:cs="Times New Roman" w:eastAsia="Times New Roman" w:hAnsi="Times New Roman"/>
-          <w:b/>
-          <w:bCs/>
-          <w:sz w:val="22"/>
-          <w:szCs w:val="22"/>
-          <w:color w:val="1A1A1A"/>
-        </w:rPr>
-        <w:t xml:space="preserve">August 2026</w:t>
-      </w:r>
-      <w:r>
-        <w:rPr>
-          <w:rFonts w:ascii="Times New Roman" w:cs="Times New Roman" w:eastAsia="Times New Roman" w:hAnsi="Times New Roman"/>
-          <w:sz w:val="22"/>
-          <w:szCs w:val="22"/>
-          <w:color w:val="1A1A1A"/>
-        </w:rPr>
-        <w:t xml:space="preserve"> budget exists, with Creative ₱50,000, Linen ₱40,000, and Stockroom ₱60,000 allocated.</w:t>
+        <w:t xml:space="preserve"> Log in with the </w:t>
+      </w:r>
+      <w:r>
+        <w:rPr>
+          <w:rFonts w:ascii="Times New Roman" w:cs="Times New Roman" w:eastAsia="Times New Roman" w:hAnsi="Times New Roman"/>
+          <w:b/>
+          <w:bCs/>
+          <w:sz w:val="22"/>
+          <w:szCs w:val="22"/>
+          <w:color w:val="1A1A1A"/>
+        </w:rPr>
+        <w:t xml:space="preserve">Accounting</w:t>
+      </w:r>
+      <w:r>
+        <w:rPr>
+          <w:rFonts w:ascii="Times New Roman" w:cs="Times New Roman" w:eastAsia="Times New Roman" w:hAnsi="Times New Roman"/>
+          <w:sz w:val="22"/>
+          <w:szCs w:val="22"/>
+          <w:color w:val="1A1A1A"/>
+        </w:rPr>
+        <w:t xml:space="preserve"> account. The entire demonstration is performed in this role.</w:t>
       </w:r>
     </w:p>
     <w:p>
@@ -1476,27 +1456,47 @@
           <w:szCs w:val="22"/>
           <w:color w:val="1A1A1A"/>
         </w:rPr>
-        <w:t xml:space="preserve"> Confirm the approval queue still contains request </w:t>
-      </w:r>
-      <w:r>
-        <w:rPr>
-          <w:rFonts w:ascii="Times New Roman" w:cs="Times New Roman" w:eastAsia="Times New Roman" w:hAnsi="Times New Roman"/>
-          <w:b/>
-          <w:bCs/>
-          <w:sz w:val="22"/>
-          <w:szCs w:val="22"/>
-          <w:color w:val="1A1A1A"/>
-        </w:rPr>
-        <w:t xml:space="preserve">PR-26-0007</w:t>
-      </w:r>
-      <w:r>
-        <w:rPr>
-          <w:rFonts w:ascii="Times New Roman" w:cs="Times New Roman" w:eastAsia="Times New Roman" w:hAnsi="Times New Roman"/>
-          <w:sz w:val="22"/>
-          <w:szCs w:val="22"/>
-          <w:color w:val="1A1A1A"/>
-        </w:rPr>
-        <w:t xml:space="preserve"> (Creative · Tropical Entrance · ₱7,000), which is used in Part 2.</w:t>
+        <w:t xml:space="preserve"> Confirm the current-month budget exists with a total of </w:t>
+      </w:r>
+      <w:r>
+        <w:rPr>
+          <w:rFonts w:ascii="Times New Roman" w:cs="Times New Roman" w:eastAsia="Times New Roman" w:hAnsi="Times New Roman"/>
+          <w:b/>
+          <w:bCs/>
+          <w:sz w:val="22"/>
+          <w:szCs w:val="22"/>
+          <w:color w:val="1A1A1A"/>
+        </w:rPr>
+        <w:t xml:space="preserve">₱150,000</w:t>
+      </w:r>
+      <w:r>
+        <w:rPr>
+          <w:rFonts w:ascii="Times New Roman" w:cs="Times New Roman" w:eastAsia="Times New Roman" w:hAnsi="Times New Roman"/>
+          <w:sz w:val="22"/>
+          <w:szCs w:val="22"/>
+          <w:color w:val="1A1A1A"/>
+        </w:rPr>
+        <w:t xml:space="preserve">, of which </w:t>
+      </w:r>
+      <w:r>
+        <w:rPr>
+          <w:rFonts w:ascii="Times New Roman" w:cs="Times New Roman" w:eastAsia="Times New Roman" w:hAnsi="Times New Roman"/>
+          <w:b/>
+          <w:bCs/>
+          <w:sz w:val="22"/>
+          <w:szCs w:val="22"/>
+          <w:color w:val="1A1A1A"/>
+        </w:rPr>
+        <w:t xml:space="preserve">₱15,000</w:t>
+      </w:r>
+      <w:r>
+        <w:rPr>
+          <w:rFonts w:ascii="Times New Roman" w:cs="Times New Roman" w:eastAsia="Times New Roman" w:hAnsi="Times New Roman"/>
+          <w:sz w:val="22"/>
+          <w:szCs w:val="22"/>
+          <w:color w:val="1A1A1A"/>
+        </w:rPr>
+        <w:t xml:space="preserve"> is allocated to Creative.</w:t>
       </w:r>
     </w:p>
     <w:p>
@@ -1522,27 +1522,47 @@
           <w:szCs w:val="22"/>
           <w:color w:val="1A1A1A"/>
         </w:rPr>
-        <w:t xml:space="preserve"> Prepare the enforcement demonstration: temporarily lower </w:t>
-      </w:r>
-      <w:r>
-        <w:rPr>
-          <w:rFonts w:ascii="Times New Roman" w:cs="Times New Roman" w:eastAsia="Times New Roman" w:hAnsi="Times New Roman"/>
-          <w:b/>
-          <w:bCs/>
-          <w:sz w:val="22"/>
-          <w:szCs w:val="22"/>
-          <w:color w:val="1A1A1A"/>
-        </w:rPr>
-        <w:t xml:space="preserve">Creative Inventory to ₱5,000</w:t>
-      </w:r>
-      <w:r>
-        <w:rPr>
-          <w:rFonts w:ascii="Times New Roman" w:cs="Times New Roman" w:eastAsia="Times New Roman" w:hAnsi="Times New Roman"/>
-          <w:sz w:val="22"/>
-          <w:szCs w:val="22"/>
-          <w:color w:val="1A1A1A"/>
-        </w:rPr>
-        <w:t xml:space="preserve"> and save, so the ₱7,000 request is blocked live.</w:t>
+        <w:t xml:space="preserve"> Confirm the approval queue contains </w:t>
+      </w:r>
+      <w:r>
+        <w:rPr>
+          <w:rFonts w:ascii="Times New Roman" w:cs="Times New Roman" w:eastAsia="Times New Roman" w:hAnsi="Times New Roman"/>
+          <w:b/>
+          <w:bCs/>
+          <w:sz w:val="22"/>
+          <w:szCs w:val="22"/>
+          <w:color w:val="1A1A1A"/>
+        </w:rPr>
+        <w:t xml:space="preserve">DK-PR-0001</w:t>
+      </w:r>
+      <w:r>
+        <w:rPr>
+          <w:rFonts w:ascii="Times New Roman" w:cs="Times New Roman" w:eastAsia="Times New Roman" w:hAnsi="Times New Roman"/>
+          <w:sz w:val="22"/>
+          <w:szCs w:val="22"/>
+          <w:color w:val="1A1A1A"/>
+        </w:rPr>
+        <w:t xml:space="preserve"> (Stockroom · ₱1,850 · approves) and </w:t>
+      </w:r>
+      <w:r>
+        <w:rPr>
+          <w:rFonts w:ascii="Times New Roman" w:cs="Times New Roman" w:eastAsia="Times New Roman" w:hAnsi="Times New Roman"/>
+          <w:b/>
+          <w:bCs/>
+          <w:sz w:val="22"/>
+          <w:szCs w:val="22"/>
+          <w:color w:val="1A1A1A"/>
+        </w:rPr>
+        <w:t xml:space="preserve">DK-PR-0002</w:t>
+      </w:r>
+      <w:r>
+        <w:rPr>
+          <w:rFonts w:ascii="Times New Roman" w:cs="Times New Roman" w:eastAsia="Times New Roman" w:hAnsi="Times New Roman"/>
+          <w:sz w:val="22"/>
+          <w:szCs w:val="22"/>
+          <w:color w:val="1A1A1A"/>
+        </w:rPr>
+        <w:t xml:space="preserve"> (Creative · ₱48,000 · blocked), used in Part 2.</w:t>
       </w:r>
     </w:p>
     <w:p>
@@ -1592,7 +1612,7 @@
           <w:sz w:val="20"/>
           <w:szCs w:val="20"/>
         </w:rPr>
-        <w:t xml:space="preserve">Why step 5 is required: </w:t>
+        <w:t xml:space="preserve">No manual preparation is needed. </w:t>
       </w:r>
       <w:r>
         <w:rPr>
@@ -1601,7 +1621,7 @@
           <w:sz w:val="20"/>
           <w:szCs w:val="20"/>
         </w:rPr>
-        <w:t xml:space="preserve">all pending requests are currently below their category budgets, so an over-budget block will not occur on its own. Either lower the Creative allocation beforehand as described, or narrate the rule from Table 4.3 instead of demonstrating it.</w:t>
+        <w:t xml:space="preserve">The demonstration kit seeds DK-PR-0002 at ₱48,000 against a Creative allocation of ₱15,000, so the over-budget block occurs on its own. Nothing has to be lowered before the demonstration or restored afterwards.</w:t>
       </w:r>
     </w:p>
     <w:p>
@@ -1625,7 +1645,7 @@
           <w:sz w:val="20"/>
           <w:szCs w:val="20"/>
         </w:rPr>
-        <w:t xml:space="preserve">After the demonstration: </w:t>
+        <w:t xml:space="preserve">Every seeded record is prefixed DK-. </w:t>
       </w:r>
       <w:r>
         <w:rPr>
@@ -1634,7 +1654,7 @@
           <w:sz w:val="20"/>
           <w:szCs w:val="20"/>
         </w:rPr>
-        <w:t xml:space="preserve">restore the Creative Inventory allocation to ₱50,000.</w:t>
+        <w:t xml:space="preserve">Re-running the seed removes and recreates only those records, so existing data is left untouched. If a record number below is missing from the screen, simply run the seed again.</w:t>
       </w:r>
     </w:p>
     <w:p>
@@ -2426,27 +2446,47 @@
           <w:szCs w:val="22"/>
           <w:color w:val="1A1A1A"/>
         </w:rPr>
-        <w:t xml:space="preserve"> Open a request that fits within budget, for example </w:t>
-      </w:r>
-      <w:r>
-        <w:rPr>
-          <w:rFonts w:ascii="Times New Roman" w:cs="Times New Roman" w:eastAsia="Times New Roman" w:hAnsi="Times New Roman"/>
-          <w:b/>
-          <w:bCs/>
-          <w:sz w:val="22"/>
-          <w:szCs w:val="22"/>
-          <w:color w:val="1A1A1A"/>
-        </w:rPr>
-        <w:t xml:space="preserve">PR-26-0030</w:t>
-      </w:r>
-      <w:r>
-        <w:rPr>
-          <w:rFonts w:ascii="Times New Roman" w:cs="Times New Roman" w:eastAsia="Times New Roman" w:hAnsi="Times New Roman"/>
-          <w:sz w:val="22"/>
-          <w:szCs w:val="22"/>
-          <w:color w:val="1A1A1A"/>
-        </w:rPr>
-        <w:t xml:space="preserve"> (Stockroom · Crates · ₱1,800).</w:t>
+        <w:t xml:space="preserve"> Open </w:t>
+      </w:r>
+      <w:r>
+        <w:rPr>
+          <w:rFonts w:ascii="Times New Roman" w:cs="Times New Roman" w:eastAsia="Times New Roman" w:hAnsi="Times New Roman"/>
+          <w:b/>
+          <w:bCs/>
+          <w:sz w:val="22"/>
+          <w:szCs w:val="22"/>
+          <w:color w:val="1A1A1A"/>
+        </w:rPr>
+        <w:t xml:space="preserve">DK-PR-0001</w:t>
+      </w:r>
+      <w:r>
+        <w:rPr>
+          <w:rFonts w:ascii="Times New Roman" w:cs="Times New Roman" w:eastAsia="Times New Roman" w:hAnsi="Times New Roman"/>
+          <w:sz w:val="22"/>
+          <w:szCs w:val="22"/>
+          <w:color w:val="1A1A1A"/>
+        </w:rPr>
+        <w:t xml:space="preserve"> (Stockroom · Chafing Dish Oval · 10 × ₱185 = </w:t>
+      </w:r>
+      <w:r>
+        <w:rPr>
+          <w:rFonts w:ascii="Times New Roman" w:cs="Times New Roman" w:eastAsia="Times New Roman" w:hAnsi="Times New Roman"/>
+          <w:b/>
+          <w:bCs/>
+          <w:sz w:val="22"/>
+          <w:szCs w:val="22"/>
+          <w:color w:val="1A1A1A"/>
+        </w:rPr>
+        <w:t xml:space="preserve">₱1,850</w:t>
+      </w:r>
+      <w:r>
+        <w:rPr>
+          <w:rFonts w:ascii="Times New Roman" w:cs="Times New Roman" w:eastAsia="Times New Roman" w:hAnsi="Times New Roman"/>
+          <w:sz w:val="22"/>
+          <w:szCs w:val="22"/>
+          <w:color w:val="1A1A1A"/>
+        </w:rPr>
+        <w:t xml:space="preserve">), which fits within budget.</w:t>
       </w:r>
     </w:p>
     <w:p>
@@ -2617,16 +2657,36 @@
           <w:szCs w:val="22"/>
           <w:color w:val="1A1A1A"/>
         </w:rPr>
-        <w:t xml:space="preserve">PR-26-0007</w:t>
-      </w:r>
-      <w:r>
-        <w:rPr>
-          <w:rFonts w:ascii="Times New Roman" w:cs="Times New Roman" w:eastAsia="Times New Roman" w:hAnsi="Times New Roman"/>
-          <w:sz w:val="22"/>
-          <w:szCs w:val="22"/>
-          <w:color w:val="1A1A1A"/>
-        </w:rPr>
-        <w:t xml:space="preserve"> (Creative · Tropical Entrance · ₱7,000) against the reduced ₱5,000 Creative allocation.</w:t>
+        <w:t xml:space="preserve">DK-PR-0002</w:t>
+      </w:r>
+      <w:r>
+        <w:rPr>
+          <w:rFonts w:ascii="Times New Roman" w:cs="Times New Roman" w:eastAsia="Times New Roman" w:hAnsi="Times New Roman"/>
+          <w:sz w:val="22"/>
+          <w:szCs w:val="22"/>
+          <w:color w:val="1A1A1A"/>
+        </w:rPr>
+        <w:t xml:space="preserve"> (Creative · Grand Entrance Arch and Floral Installation · </w:t>
+      </w:r>
+      <w:r>
+        <w:rPr>
+          <w:rFonts w:ascii="Times New Roman" w:cs="Times New Roman" w:eastAsia="Times New Roman" w:hAnsi="Times New Roman"/>
+          <w:b/>
+          <w:bCs/>
+          <w:sz w:val="22"/>
+          <w:szCs w:val="22"/>
+          <w:color w:val="1A1A1A"/>
+        </w:rPr>
+        <w:t xml:space="preserve">₱48,000</w:t>
+      </w:r>
+      <w:r>
+        <w:rPr>
+          <w:rFonts w:ascii="Times New Roman" w:cs="Times New Roman" w:eastAsia="Times New Roman" w:hAnsi="Times New Roman"/>
+          <w:sz w:val="22"/>
+          <w:szCs w:val="22"/>
+          <w:color w:val="1A1A1A"/>
+        </w:rPr>
+        <w:t xml:space="preserve">) against the ₱15,000 Creative allocation.</w:t>
       </w:r>
     </w:p>
     <w:p>
@@ -3592,7 +3652,27 @@
           <w:szCs w:val="22"/>
           <w:color w:val="1A1A1A"/>
         </w:rPr>
-        <w:t xml:space="preserve"> Open a contract on hold and show the </w:t>
+        <w:t xml:space="preserve"> Open </w:t>
+      </w:r>
+      <w:r>
+        <w:rPr>
+          <w:rFonts w:ascii="Times New Roman" w:cs="Times New Roman" w:eastAsia="Times New Roman" w:hAnsi="Times New Roman"/>
+          <w:b/>
+          <w:bCs/>
+          <w:sz w:val="22"/>
+          <w:szCs w:val="22"/>
+          <w:color w:val="1A1A1A"/>
+        </w:rPr>
+        <w:t xml:space="preserve">DK-HOLD-001</w:t>
+      </w:r>
+      <w:r>
+        <w:rPr>
+          <w:rFonts w:ascii="Times New Roman" w:cs="Times New Roman" w:eastAsia="Times New Roman" w:hAnsi="Times New Roman"/>
+          <w:sz w:val="22"/>
+          <w:szCs w:val="22"/>
+          <w:color w:val="1A1A1A"/>
+        </w:rPr>
+        <w:t xml:space="preserve"> and show the </w:t>
       </w:r>
       <w:r>
         <w:rPr>
@@ -3755,6 +3835,92 @@
           <w:color w:val="1A1A1A"/>
         </w:rPr>
         <w:t xml:space="preserve"> notification. Closing requires the event date to have passed, the balance to be fully collected, the logistics booking to be completed, and no pending post-event checks (§4.9).</w:t>
+      </w:r>
+    </w:p>
+    <w:p>
+      <w:pPr>
+        <w:spacing w:after="80"/>
+        <w:ind w:left="480" w:hanging="360"/>
+      </w:pPr>
+      <w:r>
+        <w:rPr>
+          <w:rFonts w:ascii="Times New Roman" w:cs="Times New Roman" w:eastAsia="Times New Roman" w:hAnsi="Times New Roman"/>
+          <w:b/>
+          <w:bCs/>
+          <w:sz w:val="22"/>
+          <w:szCs w:val="22"/>
+          <w:color w:val="1A1A1A"/>
+        </w:rPr>
+        <w:t xml:space="preserve">1.</w:t>
+      </w:r>
+      <w:r>
+        <w:rPr>
+          <w:rFonts w:ascii="Times New Roman" w:cs="Times New Roman" w:eastAsia="Times New Roman" w:hAnsi="Times New Roman"/>
+          <w:sz w:val="22"/>
+          <w:szCs w:val="22"/>
+          <w:color w:val="1A1A1A"/>
+        </w:rPr>
+        <w:t xml:space="preserve"> Open </w:t>
+      </w:r>
+      <w:r>
+        <w:rPr>
+          <w:rFonts w:ascii="Times New Roman" w:cs="Times New Roman" w:eastAsia="Times New Roman" w:hAnsi="Times New Roman"/>
+          <w:b/>
+          <w:bCs/>
+          <w:sz w:val="22"/>
+          <w:szCs w:val="22"/>
+          <w:color w:val="1A1A1A"/>
+        </w:rPr>
+        <w:t xml:space="preserve">DK-CLOSE-001</w:t>
+      </w:r>
+      <w:r>
+        <w:rPr>
+          <w:rFonts w:ascii="Times New Roman" w:cs="Times New Roman" w:eastAsia="Times New Roman" w:hAnsi="Times New Roman"/>
+          <w:sz w:val="22"/>
+          <w:szCs w:val="22"/>
+          <w:color w:val="1A1A1A"/>
+        </w:rPr>
+        <w:t xml:space="preserve">, which satisfies all four conditions, and show the </w:t>
+      </w:r>
+      <w:r>
+        <w:rPr>
+          <w:rFonts w:ascii="Times New Roman" w:cs="Times New Roman" w:eastAsia="Times New Roman" w:hAnsi="Times New Roman"/>
+          <w:b/>
+          <w:bCs/>
+          <w:sz w:val="22"/>
+          <w:szCs w:val="22"/>
+          <w:color w:val="1A1A1A"/>
+        </w:rPr>
+        <w:t xml:space="preserve">Awaiting Contract Close</w:t>
+      </w:r>
+      <w:r>
+        <w:rPr>
+          <w:rFonts w:ascii="Times New Roman" w:cs="Times New Roman" w:eastAsia="Times New Roman" w:hAnsi="Times New Roman"/>
+          <w:sz w:val="22"/>
+          <w:szCs w:val="22"/>
+          <w:color w:val="1A1A1A"/>
+        </w:rPr>
+        <w:t xml:space="preserve"> stage and the </w:t>
+      </w:r>
+      <w:r>
+        <w:rPr>
+          <w:rFonts w:ascii="Times New Roman" w:cs="Times New Roman" w:eastAsia="Times New Roman" w:hAnsi="Times New Roman"/>
+          <w:b/>
+          <w:bCs/>
+          <w:sz w:val="22"/>
+          <w:szCs w:val="22"/>
+          <w:color w:val="1A1A1A"/>
+        </w:rPr>
+        <w:t xml:space="preserve">Close Contract</w:t>
+      </w:r>
+      <w:r>
+        <w:rPr>
+          <w:rFonts w:ascii="Times New Roman" w:cs="Times New Roman" w:eastAsia="Times New Roman" w:hAnsi="Times New Roman"/>
+          <w:sz w:val="22"/>
+          <w:szCs w:val="22"/>
+          <w:color w:val="1A1A1A"/>
+        </w:rPr>
+        <w:t xml:space="preserve"> action.</w:t>
       </w:r>
     </w:p>
     <w:p>
@@ -3955,7 +4121,7 @@
           <w:szCs w:val="22"/>
           <w:color w:val="1A1A1A"/>
         </w:rPr>
-        <w:t xml:space="preserve">SCN-SAMEDAY-RESERVED-A</w:t>
+        <w:t xml:space="preserve">DK-SAMEDAY-A</w:t>
       </w:r>
       <w:r>
         <w:rPr>
@@ -3975,16 +4141,16 @@
           <w:szCs w:val="22"/>
           <w:color w:val="1A1A1A"/>
         </w:rPr>
-        <w:t xml:space="preserve">SCN-SAMEDAY-CONFLICT-B</w:t>
-      </w:r>
-      <w:r>
-        <w:rPr>
-          <w:rFonts w:ascii="Times New Roman" w:cs="Times New Roman" w:eastAsia="Times New Roman" w:hAnsi="Times New Roman"/>
-          <w:sz w:val="22"/>
-          <w:szCs w:val="22"/>
-          <w:color w:val="1A1A1A"/>
-        </w:rPr>
-        <w:t xml:space="preserve">, both scheduled on 6 August 2026.</w:t>
+        <w:t xml:space="preserve">DK-SAMEDAY-B</w:t>
+      </w:r>
+      <w:r>
+        <w:rPr>
+          <w:rFonts w:ascii="Times New Roman" w:cs="Times New Roman" w:eastAsia="Times New Roman" w:hAnsi="Times New Roman"/>
+          <w:sz w:val="22"/>
+          <w:szCs w:val="22"/>
+          <w:color w:val="1A1A1A"/>
+        </w:rPr>
+        <w:t xml:space="preserve">, both scheduled on the same event date.</w:t>
       </w:r>
     </w:p>
     <w:p>
@@ -4122,27 +4288,27 @@
           <w:szCs w:val="22"/>
           <w:color w:val="1A1A1A"/>
         </w:rPr>
-        <w:t xml:space="preserve"> Show the two live examples in the approval queue: </w:t>
-      </w:r>
-      <w:r>
-        <w:rPr>
-          <w:rFonts w:ascii="Times New Roman" w:cs="Times New Roman" w:eastAsia="Times New Roman" w:hAnsi="Times New Roman"/>
-          <w:b/>
-          <w:bCs/>
-          <w:sz w:val="22"/>
-          <w:szCs w:val="22"/>
-          <w:color w:val="1A1A1A"/>
-        </w:rPr>
-        <w:t xml:space="preserve">RPT-PR-2606-0001</w:t>
-      </w:r>
-      <w:r>
-        <w:rPr>
-          <w:rFonts w:ascii="Times New Roman" w:cs="Times New Roman" w:eastAsia="Times New Roman" w:hAnsi="Times New Roman"/>
-          <w:sz w:val="22"/>
-          <w:szCs w:val="22"/>
-          <w:color w:val="1A1A1A"/>
-        </w:rPr>
-        <w:t xml:space="preserve"> (Linen · Champagne Napkin · short 68 · </w:t>
+        <w:t xml:space="preserve"> Show the two live examples in the approval queue, both raised from this same shortage: </w:t>
+      </w:r>
+      <w:r>
+        <w:rPr>
+          <w:rFonts w:ascii="Times New Roman" w:cs="Times New Roman" w:eastAsia="Times New Roman" w:hAnsi="Times New Roman"/>
+          <w:b/>
+          <w:bCs/>
+          <w:sz w:val="22"/>
+          <w:szCs w:val="22"/>
+          <w:color w:val="1A1A1A"/>
+        </w:rPr>
+        <w:t xml:space="preserve">DK-PR-0003</w:t>
+      </w:r>
+      <w:r>
+        <w:rPr>
+          <w:rFonts w:ascii="Times New Roman" w:cs="Times New Roman" w:eastAsia="Times New Roman" w:hAnsi="Times New Roman"/>
+          <w:sz w:val="22"/>
+          <w:szCs w:val="22"/>
+          <w:color w:val="1A1A1A"/>
+        </w:rPr>
+        <w:t xml:space="preserve"> (Linen · short 180 · </w:t>
       </w:r>
       <w:r>
         <w:rPr>
@@ -4173,7 +4339,7 @@
           <w:szCs w:val="22"/>
           <w:color w:val="1A1A1A"/>
         </w:rPr>
-        <w:t xml:space="preserve">DEMO-PR-EMERGENCY-ACCOUNTING</w:t>
+        <w:t xml:space="preserve">DK-PR-0004</w:t>
       </w:r>
       <w:r>
         <w:rPr>
@@ -7903,7 +8069,7 @@
           <w:sz w:val="20"/>
           <w:szCs w:val="20"/>
         </w:rPr>
-        <w:t xml:space="preserve">restore the Creative Inventory allocation to ₱50,000 after the demonstration.</w:t>
+        <w:t xml:space="preserve">nothing needs to be restored afterwards. To reset for a second run — or if a record was approved during a rehearsal — simply run `npm run seed:demokit` again.</w:t>
       </w:r>
     </w:p>
     <w:sectPr>

</xml_diff>